<commit_message>
Refine exploratory data analysis and testing documentation for clarity and consistency
</commit_message>
<xml_diff>
--- a/Exploratory data analysis.docx
+++ b/Exploratory data analysis.docx
@@ -2,26 +2,6 @@
 <file path=word/document.xml><?xml version="1.0" encoding="utf-8"?>
 <w:document xmlns:wpc="http://schemas.microsoft.com/office/word/2010/wordprocessingCanvas" xmlns:cx="http://schemas.microsoft.com/office/drawing/2014/chartex" xmlns:cx1="http://schemas.microsoft.com/office/drawing/2015/9/8/chartex" xmlns:cx2="http://schemas.microsoft.com/office/drawing/2015/10/21/chartex" xmlns:cx3="http://schemas.microsoft.com/office/drawing/2016/5/9/chartex" xmlns:cx4="http://schemas.microsoft.com/office/drawing/2016/5/10/chartex" xmlns:cx5="http://schemas.microsoft.com/office/drawing/2016/5/11/chartex" xmlns:cx6="http://schemas.microsoft.com/office/drawing/2016/5/12/chartex" xmlns:cx7="http://schemas.microsoft.com/office/drawing/2016/5/13/chartex" xmlns:cx8="http://schemas.microsoft.com/office/drawing/2016/5/14/chartex" xmlns:mc="http://schemas.openxmlformats.org/markup-compatibility/2006" xmlns:aink="http://schemas.microsoft.com/office/drawing/2016/ink" xmlns:am3d="http://schemas.microsoft.com/office/drawing/2017/model3d" xmlns:o="urn:schemas-microsoft-com:office:office" xmlns:oel="http://schemas.microsoft.com/office/2019/extlst" xmlns:r="http://schemas.openxmlformats.org/officeDocument/2006/relationships" xmlns:m="http://schemas.openxmlformats.org/officeDocument/2006/math" xmlns:v="urn:schemas-microsoft-com:vml" xmlns:wp14="http://schemas.microsoft.com/office/word/2010/wordprocessingDrawing" xmlns:wp="http://schemas.openxmlformats.org/drawingml/2006/wordprocessingDrawing" xmlns:w10="urn:schemas-microsoft-com:office:word" xmlns:w="http://schemas.openxmlformats.org/wordprocessingml/2006/main" xmlns:w14="http://schemas.microsoft.com/office/word/2010/wordml" xmlns:w15="http://schemas.microsoft.com/office/word/2012/wordml" xmlns:w16cex="http://schemas.microsoft.com/office/word/2018/wordml/cex" xmlns:w16cid="http://schemas.microsoft.com/office/word/2016/wordml/cid" xmlns:w16="http://schemas.microsoft.com/office/word/2018/wordml" xmlns:w16du="http://schemas.microsoft.com/office/word/2023/wordml/word16du" xmlns:w16sdtdh="http://schemas.microsoft.com/office/word/2020/wordml/sdtdatahash" xmlns:w16se="http://schemas.microsoft.com/office/word/2015/wordml/symex" xmlns:wpg="http://schemas.microsoft.com/office/word/2010/wordprocessingGroup" xmlns:wpi="http://schemas.microsoft.com/office/word/2010/wordprocessingInk" xmlns:wne="http://schemas.microsoft.com/office/word/2006/wordml" xmlns:wps="http://schemas.microsoft.com/office/word/2010/wordprocessingShape" mc:Ignorable="w14 w15 w16se w16cid w16 w16cex w16sdtdh w16du wp14">
   <w:body>
-    <w:p>
-      <w:r>
-        <w:t>Exploratory data analysis. Your report should introduce the reader to the data by illustrating selected aspects of the data.</w:t>
-      </w:r>
-    </w:p>
-    <w:p>
-      <w:r>
-        <w:t>Visualization of data. As part of the exploratory data analysis, your report should present</w:t>
-      </w:r>
-    </w:p>
-    <w:p>
-      <w:r>
-        <w:t>a visualization of the dataset based on dimensionality reduction obtained from a principal components analysis. Remember to include some comments on what the reader can learn from the</w:t>
-      </w:r>
-    </w:p>
-    <w:p>
-      <w:r>
-        <w:t>visualization.</w:t>
-      </w:r>
-    </w:p>
     <w:p/>
     <w:p>
       <w:pPr>
@@ -44,7 +24,13 @@
     </w:p>
     <w:p>
       <w:r>
-        <w:t>Our data is composed of 10,000 train and 5,000 test images of clothing, each belonging to one of five classes: T-shirt/top, Trousers, Pullover, Dress, and S</w:t>
+        <w:t xml:space="preserve">Our data </w:t>
+      </w:r>
+      <w:r>
+        <w:t>comprises</w:t>
+      </w:r>
+      <w:r>
+        <w:t xml:space="preserve"> 10,000 train and 5,000 test images of clothing, each belonging to one of five classes: T-shirt/top, Trousers, Pullover, Dress, and S</w:t>
       </w:r>
       <w:r>
         <w:t>hirt</w:t>
@@ -59,13 +45,28 @@
         <w:t xml:space="preserve"> saved as 784 features</w:t>
       </w:r>
       <w:r>
-        <w:t>. We can compare the presence of each class in our training set with a histogram plot:</w:t>
+        <w:t>. We can compare the presence of each class in our training set with a histogram plot</w:t>
+      </w:r>
+      <w:r>
+        <w:t>/table</w:t>
+      </w:r>
+      <w:r>
+        <w:t>:</w:t>
       </w:r>
     </w:p>
     <w:p/>
     <w:p>
       <w:r>
-        <w:t xml:space="preserve">The plot shows an almost equal distribution of the classes. This means that we will not need to apply any methods for balancing, oversampling, or weighting on classes.  </w:t>
+        <w:t xml:space="preserve">The plot shows an almost equal distribution of the classes. This means that we </w:t>
+      </w:r>
+      <w:r>
+        <w:t>do not expect</w:t>
+      </w:r>
+      <w:r>
+        <w:t xml:space="preserve"> to apply any methods for balancing, oversampling, or weighting on classes</w:t>
+      </w:r>
+      <w:r>
+        <w:t>.</w:t>
       </w:r>
     </w:p>
     <w:p>
@@ -97,7 +98,31 @@
         <w:rPr>
           <w:lang w:val="en-US"/>
         </w:rPr>
-        <w:t xml:space="preserve">In an attempt to gather more information for our data before applying complex machine learning methods, we decide to apply </w:t>
+        <w:t>In an attempt to gather more information for our data before applying complex machine learning methods, we decide</w:t>
+      </w:r>
+      <w:r>
+        <w:rPr>
+          <w:lang w:val="en-US"/>
+        </w:rPr>
+        <w:t>d</w:t>
+      </w:r>
+      <w:r>
+        <w:rPr>
+          <w:lang w:val="en-US"/>
+        </w:rPr>
+        <w:t xml:space="preserve"> to </w:t>
+      </w:r>
+      <w:r>
+        <w:rPr>
+          <w:lang w:val="en-US"/>
+        </w:rPr>
+        <w:t>utilize</w:t>
+      </w:r>
+      <w:r>
+        <w:rPr>
+          <w:lang w:val="en-US"/>
+        </w:rPr>
+        <w:t xml:space="preserve"> </w:t>
       </w:r>
       <w:r>
         <w:t>principal components analysis</w:t>
@@ -106,7 +131,19 @@
         <w:rPr>
           <w:lang w:val="en-US"/>
         </w:rPr>
-        <w:t xml:space="preserve"> (PCA). We transform all of our training data and get the following scree plot:</w:t>
+        <w:t xml:space="preserve"> (PCA). We transform all of our training data and get the following </w:t>
+      </w:r>
+      <w:r>
+        <w:rPr>
+          <w:lang w:val="en-US"/>
+        </w:rPr>
+        <w:t>S</w:t>
+      </w:r>
+      <w:r>
+        <w:rPr>
+          <w:lang w:val="en-US"/>
+        </w:rPr>
+        <w:t>cree plot:</w:t>
       </w:r>
     </w:p>
     <w:p>
@@ -242,19 +279,7 @@
         <w:rPr>
           <w:lang w:val="en-US"/>
         </w:rPr>
-        <w:t xml:space="preserve"> with the data explained with 100 components which equals 89.01% of </w:t>
-      </w:r>
-      <w:r>
-        <w:rPr>
-          <w:lang w:val="en-US"/>
-        </w:rPr>
-        <w:t>cumulative variances</w:t>
-      </w:r>
-      <w:r>
-        <w:rPr>
-          <w:lang w:val="en-US"/>
-        </w:rPr>
-        <w:t xml:space="preserve">. </w:t>
+        <w:t xml:space="preserve"> with the data explained with 100 components which equals 89.01% of cumulative variances. </w:t>
       </w:r>
     </w:p>
     <w:sectPr>
@@ -674,6 +699,7 @@
   <w:style w:type="character" w:default="1" w:styleId="DefaultParagraphFont">
     <w:name w:val="Default Paragraph Font"/>
     <w:uiPriority w:val="1"/>
+    <w:semiHidden/>
     <w:unhideWhenUsed/>
   </w:style>
   <w:style w:type="table" w:default="1" w:styleId="TableNormal">

</xml_diff>